<commit_message>
Fix loan restoration validation and separate UML return arrows
</commit_message>
<xml_diff>
--- a/lab3/docs/РПП_ЛР3_Библиотека_Арышева.docx
+++ b/lab3/docs/РПП_ЛР3_Библиотека_Арышева.docx
@@ -18322,7 +18322,7 @@
         <w:widowControl/>
       </w:pPr>
       <w:r>
-        <w:t>Автоматические тесты завершились успешно: 24 теста, результат OK. Проверены основной путь, очередь FIFO, граница срока брони, отсутствие повторного напоминания, продление и отказы, просрочка, штрафы, передача администрации, слияние И, восстановление агрегатов и запрещённые сочетания состояния и события. Отдельный тест после продления проверяет отмену старых сроков, новое напоминание, просрочку в 00:00 следующего дня и передачу дела ровно в 00:00 тридцатого дня.</w:t>
+        <w:t>Автоматические тесты завершились успешно: 25 тестов, результат OK. Проверены основной путь, очередь FIFO, граница срока брони, отсутствие повторного напоминания, продление и отказы, просрочка, штрафы, передача администрации, слияние И, восстановление агрегатов, обязательность акта при повреждении и запрещённые сочетания состояния и события. Отдельный тест после продления проверяет отмену старых сроков, новое напоминание, просрочку в 00:00 следующего дня и передачу дела ровно в 00:00 тридцатого дня.</w:t>
       </w:r>
     </w:p>
     <w:p>
@@ -18340,7 +18340,7 @@
         </w:rPr>
         <w:t>python -m unittest discover -s tests -v</w:t>
         <w:br/>
-        <w:t>Ran 24 tests</w:t>
+        <w:t>Ran 25 tests</w:t>
         <w:br/>
         <w:t>OK</w:t>
       </w:r>
@@ -20506,7 +20506,7 @@
         <w:widowControl/>
       </w:pPr>
       <w:r>
-        <w:t>Архив РПП_ЛР3_Библиотека_исходники.zip содержит код программы, Dockerfile, docker-compose.yml, .env.example, README.md, 24 теста, схемы BPMN и UML и полные протоколы проверок. Файлы архива подготовлены для загрузки в личный репозиторий GitHub.</w:t>
+        <w:t>Архив РПП_ЛР3_Библиотека_исходники.zip содержит код программы, Dockerfile, docker-compose.yml, .env.example, README.md, 25 тестов, схемы BPMN и UML и полные протоколы проверок. Файлы архива подготовлены для загрузки в личный репозиторий GitHub.</w:t>
       </w:r>
     </w:p>
     <w:p>
@@ -20532,7 +20532,7 @@
     </w:p>
     <w:p>
       <w:r>
-        <w:t>Проверка: 24 теста — OK; python run.py --check — HTTP 200. Протоколы: docs/test_results.txt и docs/startup_check_2026-10-25.txt.</w:t>
+        <w:t>Проверка: 25 тестов — OK; python run.py --check — HTTP 200. Протоколы: docs/test_results.txt и docs/startup_check_2026-10-25.txt.</w:t>
       </w:r>
     </w:p>
     <w:p>

</xml_diff>